<commit_message>
docs: Sprint 1 daily scrum update
</commit_message>
<xml_diff>
--- a/ProjectManagement/Sprint1Documents/DailyScrumMeetingNotesSprint1.docx
+++ b/ProjectManagement/Sprint1Documents/DailyScrumMeetingNotesSprint1.docx
@@ -10,31 +10,61 @@
         <w:rPr>
           <w:b/>
           <w:bCs/>
-          <w:lang w:val="tr-TR" w:eastAsia="tr-TR"/>
-        </w:rPr>
-      </w:pPr>
-      <w:r>
-        <w:rPr>
+          <w:sz w:val="28"/>
+          <w:szCs w:val="28"/>
+          <w:lang w:val="tr-TR" w:eastAsia="tr-TR"/>
+        </w:rPr>
+      </w:pPr>
+      <w:r>
+        <w:rPr>
+          <w:rFonts w:ascii="Segoe UI Emoji" w:eastAsia="Times New Roman" w:hAnsi="Segoe UI Emoji" w:cs="Segoe UI Emoji"/>
           <w:b/>
           <w:bCs/>
-          <w:lang w:val="tr-TR" w:eastAsia="tr-TR"/>
-        </w:rPr>
-        <w:t xml:space="preserve">Sprint 1 – Daily </w:t>
-      </w:r>
-      <w:proofErr w:type="spellStart"/>
-      <w:r>
-        <w:rPr>
+          <w:sz w:val="27"/>
+          <w:szCs w:val="27"/>
+          <w:lang w:eastAsia="tr-TR"/>
+        </w:rPr>
+        <w:t>📅</w:t>
+      </w:r>
+      <w:r>
+        <w:rPr>
+          <w:rFonts w:eastAsia="Times New Roman"/>
           <w:b/>
           <w:bCs/>
-          <w:lang w:val="tr-TR" w:eastAsia="tr-TR"/>
-        </w:rPr>
-        <w:t>Scrum</w:t>
-      </w:r>
-      <w:proofErr w:type="spellEnd"/>
+          <w:sz w:val="27"/>
+          <w:szCs w:val="27"/>
+          <w:lang w:eastAsia="tr-TR"/>
+        </w:rPr>
+        <w:t xml:space="preserve"> </w:t>
+      </w:r>
       <w:r>
         <w:rPr>
           <w:b/>
           <w:bCs/>
+          <w:sz w:val="28"/>
+          <w:szCs w:val="28"/>
+          <w:lang w:val="tr-TR" w:eastAsia="tr-TR"/>
+        </w:rPr>
+        <w:t xml:space="preserve">Sprint 1 – Daily </w:t>
+      </w:r>
+      <w:proofErr w:type="spellStart"/>
+      <w:r>
+        <w:rPr>
+          <w:b/>
+          <w:bCs/>
+          <w:sz w:val="28"/>
+          <w:szCs w:val="28"/>
+          <w:lang w:val="tr-TR" w:eastAsia="tr-TR"/>
+        </w:rPr>
+        <w:t>Scrum</w:t>
+      </w:r>
+      <w:proofErr w:type="spellEnd"/>
+      <w:r>
+        <w:rPr>
+          <w:b/>
+          <w:bCs/>
+          <w:sz w:val="28"/>
+          <w:szCs w:val="28"/>
           <w:lang w:val="tr-TR" w:eastAsia="tr-TR"/>
         </w:rPr>
         <w:t xml:space="preserve"> Notları (19 Haziran – 5 Temmuz 2026)</w:t>

</xml_diff>